<commit_message>
Add rendered table diagram; include it in report Part 4
</commit_message>
<xml_diff>
--- a/work/Assignment1_Report.docx
+++ b/work/Assignment1_Report.docx
@@ -2,7 +2,7 @@
 <file path=word/document.xml><?xml version="1.0" encoding="utf-8"?>
 <w:document xmlns:w="http://schemas.openxmlformats.org/wordprocessingml/2006/main" xmlns:m="http://schemas.openxmlformats.org/officeDocument/2006/math" xmlns:r="http://schemas.openxmlformats.org/officeDocument/2006/relationships" xmlns:o="urn:schemas-microsoft-com:office:office" xmlns:v="urn:schemas-microsoft-com:vml" xmlns:w10="urn:schemas-microsoft-com:office:word" xmlns:a="http://schemas.openxmlformats.org/drawingml/2006/main" xmlns:pic="http://schemas.openxmlformats.org/drawingml/2006/picture" xmlns:wp="http://schemas.openxmlformats.org/drawingml/2006/wordprocessingDrawing">
   <w:body>
-    <w:bookmarkStart w:id="35" w:name="csci-49376-assignment-1"/>
+    <w:bookmarkStart w:id="39" w:name="csci-49376-assignment-1"/>
     <w:p>
       <w:pPr>
         <w:pStyle w:val="Heading1"/>
@@ -6518,7 +6518,7 @@
       </w:r>
     </w:p>
     <w:bookmarkEnd w:id="32"/>
-    <w:bookmarkStart w:id="34" w:name="part-4.-relational-schema"/>
+    <w:bookmarkStart w:id="38" w:name="part-4.-relational-schema"/>
     <w:p>
       <w:pPr>
         <w:pStyle w:val="Heading2"/>
@@ -6693,7 +6693,72 @@
         <w:t xml:space="preserve">)</w:t>
       </w:r>
     </w:p>
-    <w:bookmarkStart w:id="33" w:name="how-the-er-relationships-are-represented"/>
+    <w:bookmarkStart w:id="36" w:name="table-diagram"/>
+    <w:p>
+      <w:pPr>
+        <w:pStyle w:val="Heading3"/>
+      </w:pPr>
+      <w:r>
+        <w:t xml:space="preserve">Table diagram</w:t>
+      </w:r>
+    </w:p>
+    <w:p>
+      <w:pPr>
+        <w:pStyle w:val="FirstParagraph"/>
+      </w:pPr>
+      <w:r>
+        <w:t xml:space="preserve">The same schema drawn as tables (crow's foot notation), with the planned MySQL column types. Only the most important ENCOUNTER columns are shown.</w:t>
+      </w:r>
+    </w:p>
+    <w:p>
+      <w:pPr>
+        <w:pStyle w:val="BodyText"/>
+      </w:pPr>
+      <w:r>
+        <w:drawing>
+          <wp:inline>
+            <wp:extent cx="5334000" cy="2537460"/>
+            <wp:effectExtent b="0" l="0" r="0" t="0"/>
+            <wp:docPr descr="" title="" id="34" name="Picture"/>
+            <a:graphic>
+              <a:graphicData uri="http://schemas.openxmlformats.org/drawingml/2006/picture">
+                <pic:pic>
+                  <pic:nvPicPr>
+                    <pic:cNvPr descr="erd.png" id="35" name="Picture"/>
+                    <pic:cNvPicPr>
+                      <a:picLocks noChangeArrowheads="1" noChangeAspect="1"/>
+                    </pic:cNvPicPr>
+                  </pic:nvPicPr>
+                  <pic:blipFill>
+                    <a:blip r:embed="rId33"/>
+                    <a:stretch>
+                      <a:fillRect/>
+                    </a:stretch>
+                  </pic:blipFill>
+                  <pic:spPr bwMode="auto">
+                    <a:xfrm>
+                      <a:off x="0" y="0"/>
+                      <a:ext cx="5334000" cy="2537460"/>
+                    </a:xfrm>
+                    <a:prstGeom prst="rect">
+                      <a:avLst/>
+                    </a:prstGeom>
+                    <a:noFill/>
+                    <a:ln w="9525">
+                      <a:noFill/>
+                      <a:headEnd/>
+                      <a:tailEnd/>
+                    </a:ln>
+                  </pic:spPr>
+                </pic:pic>
+              </a:graphicData>
+            </a:graphic>
+          </wp:inline>
+        </w:drawing>
+      </w:r>
+    </w:p>
+    <w:bookmarkEnd w:id="36"/>
+    <w:bookmarkStart w:id="37" w:name="how-the-er-relationships-are-represented"/>
     <w:p>
       <w:pPr>
         <w:pStyle w:val="Heading3"/>
@@ -7192,9 +7257,9 @@
         <w:t xml:space="preserve">(needed so every foreign key has a parent): patient, admission_type, discharge_disposition, admission_source, diagnosis → encounter → encounter_diagnosis.</w:t>
       </w:r>
     </w:p>
-    <w:bookmarkEnd w:id="33"/>
-    <w:bookmarkEnd w:id="34"/>
-    <w:bookmarkEnd w:id="35"/>
+    <w:bookmarkEnd w:id="37"/>
+    <w:bookmarkEnd w:id="38"/>
+    <w:bookmarkEnd w:id="39"/>
     <w:sectPr>
       <w:pgMar w:left="1440" w:right="1440"/>
     </w:sectPr>

</xml_diff>